<commit_message>
feat(plantillas): remuneración como cláusula TERCERO en los 21 contratos
A pedido de Cristian: el detalle de sueldo, gratificación y asignaciones
sube a TERCERO en todas las plantillas de contrato (antes QUINTO en
ATENDEDOR/Disfruto/Lucumo y OCTAVO en aStop); jornada y demás cláusulas
corren un número. Reordenado por bloques con tablas intactas y validación
XML estricta + secuencia de cláusulas por archivo.

Co-Authored-By: Claude Fable 5 <noreply@anthropic.com>
</commit_message>
<xml_diff>
--- a/app/plantillas/DISFRUTO 77254588-6/CONTRATO ATENDEDOR ALMACEN FT - Indefinido.docx
+++ b/app/plantillas/DISFRUTO 77254588-6/CONTRATO ATENDEDOR ALMACEN FT - Indefinido.docx
@@ -118,10 +118,16 @@
           <w:b/>
           <w:bCs/>
         </w:rPr>
-        <w:t>TERCERO</w:t>
-      </w:r>
-      <w:r>
-        <w:t>: Según lo dispone el numeral 2 del artículo 38 del Código del Trabajo, la jornada de trabajo será de {HORAS_SEMANALES} horas semanales, distribuidas conforme a los siguientes turnos que se informan a continuación:   </w:t>
+        <w:t xml:space="preserve">TERCERO: REMUNERACIÓN Y ASIGNACIONES. 1) Sueldo Base: ${SUELDO_BASE} ({SUELDO_BASE_PALABRA}).2) Gratificación: {GRATIFICACION_TEXTO}. 3) Asignación de Pérdida de Caja: {ASIGNACION_CAJA_TEXTO}. 4) Asignación de Movilización: ${ASIGNACION_MOVILIZACION}, ({ASIGNACION_MOVILIZACION_PALABRA}).5) Asignación de Colación: ${ASIGNACION_COLACION}, ({ASIGNACION_COLACION_PALABRA}).</w:t>
+      </w:r>
+    </w:p>
+    <w:p>
+      <w:r>
+        <w:rPr>
+          <w:b/>
+          <w:bCs/>
+        </w:rPr>
+        <w:t xml:space="preserve">CUARTO: Según lo dispone el numeral 2 del artículo 38 del Código del Trabajo, la jornada de trabajo será de {HORAS_SEMANALES} horas semanales, distribuidas conforme a los siguientes turnos que se informan a continuación:</w:t>
       </w:r>
     </w:p>
     <w:p>
@@ -420,47 +426,7 @@
           <w:b/>
           <w:bCs/>
         </w:rPr>
-        <w:t>CUARTO</w:t>
-      </w:r>
-      <w:r>
-        <w:t>: Queda estrictamente prohibido al trabajador, cumplir funciones en horas extraordinarias sin autorización escrita del empleador. </w:t>
-      </w:r>
-    </w:p>
-    <w:p>
-      <w:r>
-        <w:rPr>
-          <w:b/>
-          <w:bCs/>
-        </w:rPr>
-        <w:t>QUINTO:</w:t>
-      </w:r>
-      <w:r>
-        <w:t xml:space="preserve"> REMUNERACIÓN Y ASIGNACIONES. </w:t>
-      </w:r>
-      <w:r>
-        <w:br/>
-        <w:t>1) Sueldo Base: ${SUELDO_BASE} ({SUELDO_BASE_PALABRA}).</w:t>
-      </w:r>
-      <w:r>
-        <w:br/>
-        <w:t>2) Gratificación: {GRATIFICACION_TEXTO}. </w:t>
-      </w:r>
-      <w:r>
-        <w:br/>
-        <w:t xml:space="preserve">3) Asignación de Pérdida de Caja: {ASIGNACION_CAJA_TEXTO}. </w:t>
-      </w:r>
-      <w:r>
-        <w:rPr>
-          <w:u w:val="single"/>
-        </w:rPr>
-        <w:br/>
-      </w:r>
-      <w:r>
-        <w:t>4) Asignación de Movilización: ${ASIGNACION_MOVILIZACION}, ({ASIGNACION_MOVILIZACION_PALABRA}).</w:t>
-      </w:r>
-      <w:r>
-        <w:br/>
-        <w:t>5) Asignación de Colación: ${ASIGNACION_COLACION}, ({ASIGNACION_COLACION_PALABRA}). </w:t>
+        <w:t xml:space="preserve">QUINTO: Queda estrictamente prohibido al trabajador, cumplir funciones en horas extraordinarias sin autorización escrita del empleador.</w:t>
       </w:r>
     </w:p>
     <w:p>

</xml_diff>